<commit_message>
reviewing edits to data management plan
</commit_message>
<xml_diff>
--- a/DMP_v2.2_Changes_Summary_HREC_FINAL.docx
+++ b/DMP_v2.2_Changes_Summary_HREC_FINAL.docx
@@ -354,6 +354,18 @@
     <w:p>
       <w:pPr>
         <w:spacing w:before="240" w:beforeAutospacing="off" w:after="240" w:afterAutospacing="off"/>
+        <w:rPr>
+          <w:rFonts w:ascii="Times New Roman" w:hAnsi="Times New Roman" w:eastAsia="Times New Roman" w:cs="Times New Roman"/>
+          <w:b w:val="0"/>
+          <w:bCs w:val="0"/>
+          <w:i w:val="0"/>
+          <w:iCs w:val="0"/>
+          <w:caps w:val="0"/>
+          <w:smallCaps w:val="0"/>
+          <w:noProof w:val="0"/>
+          <w:color w:val="000000" w:themeColor="text1" w:themeTint="FF" w:themeShade="FF"/>
+          <w:lang w:val="en-US"/>
+        </w:rPr>
       </w:pPr>
       <w:r>
         <w:rPr>
@@ -383,7 +395,276 @@
           <w:color w:val="000000" w:themeColor="text1" w:themeTint="FF" w:themeShade="FF"/>
           <w:lang w:val="en-US"/>
         </w:rPr>
-        <w:t xml:space="preserve"> Temporary infrastructure transition during Year 5 to enhance data management capabilities through cloud infrastructure migration. This amendment documents a transition period where dual infrastructure capability (UCT on-premise and WHC-managed cloud) is maintained, with complete migration to cloud by end of Year 5. All existing ethical safeguards are maintained and enhanced.</w:t>
+        <w:t xml:space="preserve"> </w:t>
+      </w:r>
+      <w:del w:author="Lisa van Aardenne" w:date="2025-08-25T13:39:29.142Z" w:id="137816925">
+        <w:r>
+          <w:rPr>
+            <w:rFonts w:ascii="Times New Roman" w:hAnsi="Times New Roman" w:eastAsia="Times New Roman" w:cs="Times New Roman"/>
+            <w:b w:val="0"/>
+            <w:bCs w:val="0"/>
+            <w:i w:val="0"/>
+            <w:iCs w:val="0"/>
+            <w:caps w:val="0"/>
+            <w:smallCaps w:val="0"/>
+            <w:noProof w:val="0"/>
+            <w:color w:val="000000" w:themeColor="text1" w:themeTint="FF" w:themeShade="FF"/>
+            <w:lang w:val="en-US"/>
+          </w:rPr>
+          <w:delText>Temporary</w:delText>
+        </w:r>
+      </w:del>
+      <w:r>
+        <w:rPr>
+          <w:rFonts w:ascii="Times New Roman" w:hAnsi="Times New Roman" w:eastAsia="Times New Roman" w:cs="Times New Roman"/>
+          <w:b w:val="0"/>
+          <w:bCs w:val="0"/>
+          <w:i w:val="0"/>
+          <w:iCs w:val="0"/>
+          <w:caps w:val="0"/>
+          <w:smallCaps w:val="0"/>
+          <w:noProof w:val="0"/>
+          <w:color w:val="000000" w:themeColor="text1" w:themeTint="FF" w:themeShade="FF"/>
+          <w:lang w:val="en-US"/>
+        </w:rPr>
+        <w:t xml:space="preserve"> </w:t>
+      </w:r>
+      <w:del w:author="Lisa van Aardenne" w:date="2025-08-25T13:39:34.11Z" w:id="992372782">
+        <w:r>
+          <w:rPr>
+            <w:rFonts w:ascii="Times New Roman" w:hAnsi="Times New Roman" w:eastAsia="Times New Roman" w:cs="Times New Roman"/>
+            <w:b w:val="0"/>
+            <w:bCs w:val="0"/>
+            <w:i w:val="0"/>
+            <w:iCs w:val="0"/>
+            <w:caps w:val="0"/>
+            <w:smallCaps w:val="0"/>
+            <w:noProof w:val="0"/>
+            <w:color w:val="000000" w:themeColor="text1" w:themeTint="FF" w:themeShade="FF"/>
+            <w:lang w:val="en-US"/>
+          </w:rPr>
+          <w:delText>i</w:delText>
+        </w:r>
+      </w:del>
+      <w:ins w:author="Lisa van Aardenne" w:date="2025-08-25T13:39:43.98Z" w:id="592292240">
+        <w:r>
+          <w:rPr>
+            <w:rFonts w:ascii="Times New Roman" w:hAnsi="Times New Roman" w:eastAsia="Times New Roman" w:cs="Times New Roman"/>
+            <w:b w:val="0"/>
+            <w:bCs w:val="0"/>
+            <w:i w:val="0"/>
+            <w:iCs w:val="0"/>
+            <w:caps w:val="0"/>
+            <w:smallCaps w:val="0"/>
+            <w:noProof w:val="0"/>
+            <w:color w:val="000000" w:themeColor="text1" w:themeTint="FF" w:themeShade="FF"/>
+            <w:lang w:val="en-US"/>
+          </w:rPr>
+          <w:t>I</w:t>
+        </w:r>
+      </w:ins>
+      <w:r>
+        <w:rPr>
+          <w:rFonts w:ascii="Times New Roman" w:hAnsi="Times New Roman" w:eastAsia="Times New Roman" w:cs="Times New Roman"/>
+          <w:b w:val="0"/>
+          <w:bCs w:val="0"/>
+          <w:i w:val="0"/>
+          <w:iCs w:val="0"/>
+          <w:caps w:val="0"/>
+          <w:smallCaps w:val="0"/>
+          <w:noProof w:val="0"/>
+          <w:color w:val="000000" w:themeColor="text1" w:themeTint="FF" w:themeShade="FF"/>
+          <w:lang w:val="en-US"/>
+        </w:rPr>
+        <w:t>nfrastructure transition during Year 5 to enhance data management capabilities through</w:t>
+      </w:r>
+      <w:ins w:author="Lisa van Aardenne" w:date="2025-08-25T13:40:52.022Z" w:id="559263515">
+        <w:r>
+          <w:rPr>
+            <w:rFonts w:ascii="Times New Roman" w:hAnsi="Times New Roman" w:eastAsia="Times New Roman" w:cs="Times New Roman"/>
+            <w:b w:val="0"/>
+            <w:bCs w:val="0"/>
+            <w:i w:val="0"/>
+            <w:iCs w:val="0"/>
+            <w:caps w:val="0"/>
+            <w:smallCaps w:val="0"/>
+            <w:noProof w:val="0"/>
+            <w:color w:val="000000" w:themeColor="text1" w:themeTint="FF" w:themeShade="FF"/>
+            <w:lang w:val="en-US"/>
+          </w:rPr>
+          <w:t xml:space="preserve"> migration from </w:t>
+        </w:r>
+      </w:ins>
+      <w:ins w:author="Lisa van Aardenne" w:date="2025-08-25T13:41:55.549Z" w:id="4242341">
+        <w:r>
+          <w:rPr>
+            <w:rFonts w:ascii="Times New Roman" w:hAnsi="Times New Roman" w:eastAsia="Times New Roman" w:cs="Times New Roman"/>
+            <w:b w:val="0"/>
+            <w:bCs w:val="0"/>
+            <w:i w:val="0"/>
+            <w:iCs w:val="0"/>
+            <w:caps w:val="0"/>
+            <w:smallCaps w:val="0"/>
+            <w:noProof w:val="0"/>
+            <w:color w:val="000000" w:themeColor="text1" w:themeTint="FF" w:themeShade="FF"/>
+            <w:lang w:val="en-US"/>
+          </w:rPr>
+          <w:t>on-premise</w:t>
+        </w:r>
+      </w:ins>
+      <w:ins w:author="Lisa van Aardenne" w:date="2025-08-25T13:40:52.022Z" w:id="1643465349">
+        <w:r>
+          <w:rPr>
+            <w:rFonts w:ascii="Times New Roman" w:hAnsi="Times New Roman" w:eastAsia="Times New Roman" w:cs="Times New Roman"/>
+            <w:b w:val="0"/>
+            <w:bCs w:val="0"/>
+            <w:i w:val="0"/>
+            <w:iCs w:val="0"/>
+            <w:caps w:val="0"/>
+            <w:smallCaps w:val="0"/>
+            <w:noProof w:val="0"/>
+            <w:color w:val="000000" w:themeColor="text1" w:themeTint="FF" w:themeShade="FF"/>
+            <w:lang w:val="en-US"/>
+          </w:rPr>
+          <w:t xml:space="preserve"> to</w:t>
+        </w:r>
+      </w:ins>
+      <w:r>
+        <w:rPr>
+          <w:rFonts w:ascii="Times New Roman" w:hAnsi="Times New Roman" w:eastAsia="Times New Roman" w:cs="Times New Roman"/>
+          <w:b w:val="0"/>
+          <w:bCs w:val="0"/>
+          <w:i w:val="0"/>
+          <w:iCs w:val="0"/>
+          <w:caps w:val="0"/>
+          <w:smallCaps w:val="0"/>
+          <w:noProof w:val="0"/>
+          <w:color w:val="000000" w:themeColor="text1" w:themeTint="FF" w:themeShade="FF"/>
+          <w:lang w:val="en-US"/>
+        </w:rPr>
+        <w:t xml:space="preserve"> cloud infrastructure</w:t>
+      </w:r>
+      <w:del w:author="Lisa van Aardenne" w:date="2025-08-25T13:40:58.051Z" w:id="960592127">
+        <w:r>
+          <w:rPr>
+            <w:rFonts w:ascii="Times New Roman" w:hAnsi="Times New Roman" w:eastAsia="Times New Roman" w:cs="Times New Roman"/>
+            <w:b w:val="0"/>
+            <w:bCs w:val="0"/>
+            <w:i w:val="0"/>
+            <w:iCs w:val="0"/>
+            <w:caps w:val="0"/>
+            <w:smallCaps w:val="0"/>
+            <w:noProof w:val="0"/>
+            <w:color w:val="000000" w:themeColor="text1" w:themeTint="FF" w:themeShade="FF"/>
+            <w:lang w:val="en-US"/>
+          </w:rPr>
+          <w:delText xml:space="preserve"> migration</w:delText>
+        </w:r>
+      </w:del>
+      <w:r>
+        <w:rPr>
+          <w:rFonts w:ascii="Times New Roman" w:hAnsi="Times New Roman" w:eastAsia="Times New Roman" w:cs="Times New Roman"/>
+          <w:b w:val="0"/>
+          <w:bCs w:val="0"/>
+          <w:i w:val="0"/>
+          <w:iCs w:val="0"/>
+          <w:caps w:val="0"/>
+          <w:smallCaps w:val="0"/>
+          <w:noProof w:val="0"/>
+          <w:color w:val="000000" w:themeColor="text1" w:themeTint="FF" w:themeShade="FF"/>
+          <w:lang w:val="en-US"/>
+        </w:rPr>
+        <w:t xml:space="preserve">. This amendment documents a transition period where dual infrastructure capability (UCT </w:t>
+      </w:r>
+      <w:r>
+        <w:rPr>
+          <w:rFonts w:ascii="Times New Roman" w:hAnsi="Times New Roman" w:eastAsia="Times New Roman" w:cs="Times New Roman"/>
+          <w:b w:val="0"/>
+          <w:bCs w:val="0"/>
+          <w:i w:val="0"/>
+          <w:iCs w:val="0"/>
+          <w:caps w:val="0"/>
+          <w:smallCaps w:val="0"/>
+          <w:noProof w:val="0"/>
+          <w:color w:val="000000" w:themeColor="text1" w:themeTint="FF" w:themeShade="FF"/>
+          <w:lang w:val="en-US"/>
+        </w:rPr>
+        <w:t>on-premise</w:t>
+      </w:r>
+      <w:r>
+        <w:rPr>
+          <w:rFonts w:ascii="Times New Roman" w:hAnsi="Times New Roman" w:eastAsia="Times New Roman" w:cs="Times New Roman"/>
+          <w:b w:val="0"/>
+          <w:bCs w:val="0"/>
+          <w:i w:val="0"/>
+          <w:iCs w:val="0"/>
+          <w:caps w:val="0"/>
+          <w:smallCaps w:val="0"/>
+          <w:noProof w:val="0"/>
+          <w:color w:val="000000" w:themeColor="text1" w:themeTint="FF" w:themeShade="FF"/>
+          <w:lang w:val="en-US"/>
+        </w:rPr>
+        <w:t xml:space="preserve"> and WHC-managed cloud) is </w:t>
+      </w:r>
+      <w:r>
+        <w:rPr>
+          <w:rFonts w:ascii="Times New Roman" w:hAnsi="Times New Roman" w:eastAsia="Times New Roman" w:cs="Times New Roman"/>
+          <w:b w:val="0"/>
+          <w:bCs w:val="0"/>
+          <w:i w:val="0"/>
+          <w:iCs w:val="0"/>
+          <w:caps w:val="0"/>
+          <w:smallCaps w:val="0"/>
+          <w:noProof w:val="0"/>
+          <w:color w:val="000000" w:themeColor="text1" w:themeTint="FF" w:themeShade="FF"/>
+          <w:lang w:val="en-US"/>
+        </w:rPr>
+        <w:t>maintained</w:t>
+      </w:r>
+      <w:r>
+        <w:rPr>
+          <w:rFonts w:ascii="Times New Roman" w:hAnsi="Times New Roman" w:eastAsia="Times New Roman" w:cs="Times New Roman"/>
+          <w:b w:val="0"/>
+          <w:bCs w:val="0"/>
+          <w:i w:val="0"/>
+          <w:iCs w:val="0"/>
+          <w:caps w:val="0"/>
+          <w:smallCaps w:val="0"/>
+          <w:noProof w:val="0"/>
+          <w:color w:val="000000" w:themeColor="text1" w:themeTint="FF" w:themeShade="FF"/>
+          <w:lang w:val="en-US"/>
+        </w:rPr>
+        <w:t xml:space="preserve">, with complete migration to cloud by end of Year 5. All existing ethical safeguards are </w:t>
+      </w:r>
+      <w:r>
+        <w:rPr>
+          <w:rFonts w:ascii="Times New Roman" w:hAnsi="Times New Roman" w:eastAsia="Times New Roman" w:cs="Times New Roman"/>
+          <w:b w:val="0"/>
+          <w:bCs w:val="0"/>
+          <w:i w:val="0"/>
+          <w:iCs w:val="0"/>
+          <w:caps w:val="0"/>
+          <w:smallCaps w:val="0"/>
+          <w:noProof w:val="0"/>
+          <w:color w:val="000000" w:themeColor="text1" w:themeTint="FF" w:themeShade="FF"/>
+          <w:lang w:val="en-US"/>
+        </w:rPr>
+        <w:t>maintained</w:t>
+      </w:r>
+      <w:r>
+        <w:rPr>
+          <w:rFonts w:ascii="Times New Roman" w:hAnsi="Times New Roman" w:eastAsia="Times New Roman" w:cs="Times New Roman"/>
+          <w:b w:val="0"/>
+          <w:bCs w:val="0"/>
+          <w:i w:val="0"/>
+          <w:iCs w:val="0"/>
+          <w:caps w:val="0"/>
+          <w:smallCaps w:val="0"/>
+          <w:noProof w:val="0"/>
+          <w:color w:val="000000" w:themeColor="text1" w:themeTint="FF" w:themeShade="FF"/>
+          <w:lang w:val="en-US"/>
+        </w:rPr>
+        <w:t xml:space="preserve"> and enhanced.</w:t>
       </w:r>
     </w:p>
     <w:p>
@@ -418,8 +699,25 @@
           <w:color w:val="000000" w:themeColor="text1" w:themeTint="FF" w:themeShade="FF"/>
           <w:lang w:val="en-US"/>
         </w:rPr>
-        <w:t xml:space="preserve"> No direct impact on participants. Enhanced data protection and security measures only.</w:t>
-      </w:r>
+        <w:t xml:space="preserve"> No direct impact on participants. </w:t>
+      </w:r>
+      <w:del w:author="Lisa van Aardenne" w:date="2025-08-25T13:43:38.945Z" w:id="1286560229">
+        <w:r>
+          <w:rPr>
+            <w:rFonts w:ascii="Times New Roman" w:hAnsi="Times New Roman" w:eastAsia="Times New Roman" w:cs="Times New Roman"/>
+            <w:b w:val="0"/>
+            <w:bCs w:val="0"/>
+            <w:i w:val="0"/>
+            <w:iCs w:val="0"/>
+            <w:caps w:val="0"/>
+            <w:smallCaps w:val="0"/>
+            <w:noProof w:val="0"/>
+            <w:color w:val="000000" w:themeColor="text1" w:themeTint="FF" w:themeShade="FF"/>
+            <w:lang w:val="en-US"/>
+          </w:rPr>
+          <w:delText>Enhanced data protection and security measures only.</w:delText>
+        </w:r>
+      </w:del>
     </w:p>
     <w:p>
       <w:pPr>
@@ -692,6 +990,16 @@
             <w:pPr>
               <w:spacing w:before="0" w:beforeAutospacing="off" w:after="0" w:afterAutospacing="off"/>
               <w:jc w:val="left"/>
+              <w:rPr>
+                <w:rFonts w:ascii="Times New Roman" w:hAnsi="Times New Roman" w:eastAsia="Times New Roman" w:cs="Times New Roman"/>
+                <w:b w:val="0"/>
+                <w:bCs w:val="0"/>
+                <w:i w:val="0"/>
+                <w:iCs w:val="0"/>
+                <w:caps w:val="0"/>
+                <w:smallCaps w:val="0"/>
+                <w:color w:val="000000" w:themeColor="text1" w:themeTint="FF" w:themeShade="FF"/>
+              </w:rPr>
             </w:pPr>
             <w:r>
               <w:rPr>
@@ -741,7 +1049,50 @@
                 <w:smallCaps w:val="0"/>
                 <w:color w:val="000000" w:themeColor="text1" w:themeTint="FF" w:themeShade="FF"/>
               </w:rPr>
-              <w:t>Provides transparent timeline for infrastructure changes. Ensures stakeholder understanding that this is a temporary transition, not permanent hybrid model. No impact on participant data protection.</w:t>
+              <w:t xml:space="preserve">Provides transparent timeline for infrastructure changes. Ensures stakeholder understanding that this is a temporary </w:t>
+            </w:r>
+            <w:del w:author="Lisa van Aardenne" w:date="2025-08-25T13:46:32.166Z" w:id="312138070">
+              <w:r>
+                <w:rPr>
+                  <w:rFonts w:ascii="Times New Roman" w:hAnsi="Times New Roman" w:eastAsia="Times New Roman" w:cs="Times New Roman"/>
+                  <w:b w:val="0"/>
+                  <w:bCs w:val="0"/>
+                  <w:i w:val="0"/>
+                  <w:iCs w:val="0"/>
+                  <w:caps w:val="0"/>
+                  <w:smallCaps w:val="0"/>
+                  <w:color w:val="000000" w:themeColor="text1" w:themeTint="FF" w:themeShade="FF"/>
+                </w:rPr>
+                <w:delText>transition</w:delText>
+              </w:r>
+            </w:del>
+            <w:ins w:author="Lisa van Aardenne" w:date="2025-08-25T13:46:22.574Z" w:id="1833909303">
+              <w:r>
+                <w:rPr>
+                  <w:rFonts w:ascii="Times New Roman" w:hAnsi="Times New Roman" w:eastAsia="Times New Roman" w:cs="Times New Roman"/>
+                  <w:b w:val="0"/>
+                  <w:bCs w:val="0"/>
+                  <w:i w:val="0"/>
+                  <w:iCs w:val="0"/>
+                  <w:caps w:val="0"/>
+                  <w:smallCaps w:val="0"/>
+                  <w:color w:val="000000" w:themeColor="text1" w:themeTint="FF" w:themeShade="FF"/>
+                </w:rPr>
+                <w:t xml:space="preserve"> situation</w:t>
+              </w:r>
+            </w:ins>
+            <w:r>
+              <w:rPr>
+                <w:rFonts w:ascii="Times New Roman" w:hAnsi="Times New Roman" w:eastAsia="Times New Roman" w:cs="Times New Roman"/>
+                <w:b w:val="0"/>
+                <w:bCs w:val="0"/>
+                <w:i w:val="0"/>
+                <w:iCs w:val="0"/>
+                <w:caps w:val="0"/>
+                <w:smallCaps w:val="0"/>
+                <w:color w:val="000000" w:themeColor="text1" w:themeTint="FF" w:themeShade="FF"/>
+              </w:rPr>
+              <w:t>, not permanent hybrid model. No impact on participant data protection.</w:t>
             </w:r>
           </w:p>
         </w:tc>
@@ -3074,7 +3425,99 @@
           <w:color w:val="000000" w:themeColor="text1" w:themeTint="FF" w:themeShade="FF"/>
           <w:lang w:val="en-US"/>
         </w:rPr>
-        <w:t>These amendments document a temporary infrastructure transition during Year 5 that enhances data protection and research capabilities. The transition will be complete by end of Year 5 with full migration to secure cloud infrastructure. All existing ethical safeguards are maintained and enhanced. No changes to research methodology, participant recruitment, or data collection procedures.</w:t>
+        <w:t xml:space="preserve">These amendments document a </w:t>
+      </w:r>
+      <w:del w:author="Lisa van Aardenne" w:date="2025-08-25T13:51:07.346Z" w:id="505962247">
+        <w:r>
+          <w:rPr>
+            <w:rFonts w:ascii="Times New Roman" w:hAnsi="Times New Roman" w:eastAsia="Times New Roman" w:cs="Times New Roman"/>
+            <w:b w:val="0"/>
+            <w:bCs w:val="0"/>
+            <w:i w:val="0"/>
+            <w:iCs w:val="0"/>
+            <w:caps w:val="0"/>
+            <w:smallCaps w:val="0"/>
+            <w:noProof w:val="0"/>
+            <w:color w:val="000000" w:themeColor="text1" w:themeTint="FF" w:themeShade="FF"/>
+            <w:lang w:val="en-US"/>
+          </w:rPr>
+          <w:delText>temporary</w:delText>
+        </w:r>
+      </w:del>
+      <w:r>
+        <w:rPr>
+          <w:rFonts w:ascii="Times New Roman" w:hAnsi="Times New Roman" w:eastAsia="Times New Roman" w:cs="Times New Roman"/>
+          <w:b w:val="0"/>
+          <w:bCs w:val="0"/>
+          <w:i w:val="0"/>
+          <w:iCs w:val="0"/>
+          <w:caps w:val="0"/>
+          <w:smallCaps w:val="0"/>
+          <w:noProof w:val="0"/>
+          <w:color w:val="000000" w:themeColor="text1" w:themeTint="FF" w:themeShade="FF"/>
+          <w:lang w:val="en-US"/>
+        </w:rPr>
+        <w:t xml:space="preserve"> infrastructure transition during Year 5 that enhances data protection and research capabilities. The transition will be complete by end of Year 5 with full migration to secure cloud infrastructure. All existing ethical safeguards are </w:t>
+      </w:r>
+      <w:r>
+        <w:rPr>
+          <w:rFonts w:ascii="Times New Roman" w:hAnsi="Times New Roman" w:eastAsia="Times New Roman" w:cs="Times New Roman"/>
+          <w:b w:val="0"/>
+          <w:bCs w:val="0"/>
+          <w:i w:val="0"/>
+          <w:iCs w:val="0"/>
+          <w:caps w:val="0"/>
+          <w:smallCaps w:val="0"/>
+          <w:noProof w:val="0"/>
+          <w:color w:val="000000" w:themeColor="text1" w:themeTint="FF" w:themeShade="FF"/>
+          <w:lang w:val="en-US"/>
+        </w:rPr>
+        <w:t>maintained</w:t>
+      </w:r>
+      <w:r>
+        <w:rPr>
+          <w:rFonts w:ascii="Times New Roman" w:hAnsi="Times New Roman" w:eastAsia="Times New Roman" w:cs="Times New Roman"/>
+          <w:b w:val="0"/>
+          <w:bCs w:val="0"/>
+          <w:i w:val="0"/>
+          <w:iCs w:val="0"/>
+          <w:caps w:val="0"/>
+          <w:smallCaps w:val="0"/>
+          <w:noProof w:val="0"/>
+          <w:color w:val="000000" w:themeColor="text1" w:themeTint="FF" w:themeShade="FF"/>
+          <w:lang w:val="en-US"/>
+        </w:rPr>
+        <w:t xml:space="preserve"> and enhanced. No changes to research </w:t>
+      </w:r>
+      <w:r>
+        <w:rPr>
+          <w:rFonts w:ascii="Times New Roman" w:hAnsi="Times New Roman" w:eastAsia="Times New Roman" w:cs="Times New Roman"/>
+          <w:b w:val="0"/>
+          <w:bCs w:val="0"/>
+          <w:i w:val="0"/>
+          <w:iCs w:val="0"/>
+          <w:caps w:val="0"/>
+          <w:smallCaps w:val="0"/>
+          <w:noProof w:val="0"/>
+          <w:color w:val="000000" w:themeColor="text1" w:themeTint="FF" w:themeShade="FF"/>
+          <w:lang w:val="en-US"/>
+        </w:rPr>
+        <w:t>methodology</w:t>
+      </w:r>
+      <w:r>
+        <w:rPr>
+          <w:rFonts w:ascii="Times New Roman" w:hAnsi="Times New Roman" w:eastAsia="Times New Roman" w:cs="Times New Roman"/>
+          <w:b w:val="0"/>
+          <w:bCs w:val="0"/>
+          <w:i w:val="0"/>
+          <w:iCs w:val="0"/>
+          <w:caps w:val="0"/>
+          <w:smallCaps w:val="0"/>
+          <w:noProof w:val="0"/>
+          <w:color w:val="000000" w:themeColor="text1" w:themeTint="FF" w:themeShade="FF"/>
+          <w:lang w:val="en-US"/>
+        </w:rPr>
+        <w:t>, participant recruitment, or data collection procedures.</w:t>
       </w:r>
     </w:p>
     <w:p>

</xml_diff>

<commit_message>
reworking after Lisas changes
</commit_message>
<xml_diff>
--- a/DMP_v2.2_Changes_Summary_HREC_FINAL.docx
+++ b/DMP_v2.2_Changes_Summary_HREC_FINAL.docx
@@ -211,7 +211,7 @@
           <w:color w:val="000000" w:themeColor="text1" w:themeTint="FF" w:themeShade="FF"/>
           <w:lang w:val="en-US"/>
         </w:rPr>
-        <w:t xml:space="preserve"> August 2025</w:t>
+        <w:t xml:space="preserve"> September 2025</w:t>
       </w:r>
     </w:p>
     <w:p>
@@ -395,25 +395,8 @@
           <w:color w:val="000000" w:themeColor="text1" w:themeTint="FF" w:themeShade="FF"/>
           <w:lang w:val="en-US"/>
         </w:rPr>
-        <w:t xml:space="preserve"> </w:t>
-      </w:r>
-      <w:del w:author="Lisa van Aardenne" w:date="2025-08-25T13:39:29.142Z" w:id="137816925">
-        <w:r>
-          <w:rPr>
-            <w:rFonts w:ascii="Times New Roman" w:hAnsi="Times New Roman" w:eastAsia="Times New Roman" w:cs="Times New Roman"/>
-            <w:b w:val="0"/>
-            <w:bCs w:val="0"/>
-            <w:i w:val="0"/>
-            <w:iCs w:val="0"/>
-            <w:caps w:val="0"/>
-            <w:smallCaps w:val="0"/>
-            <w:noProof w:val="0"/>
-            <w:color w:val="000000" w:themeColor="text1" w:themeTint="FF" w:themeShade="FF"/>
-            <w:lang w:val="en-US"/>
-          </w:rPr>
-          <w:delText>Temporary</w:delText>
-        </w:r>
-      </w:del>
+        <w:t xml:space="preserve">  Infrastructure transition during Year 5 to enhance data management capabilities through migration from </w:t>
+      </w:r>
       <w:r>
         <w:rPr>
           <w:rFonts w:ascii="Times New Roman" w:hAnsi="Times New Roman" w:eastAsia="Times New Roman" w:cs="Times New Roman"/>
@@ -427,42 +410,8 @@
           <w:color w:val="000000" w:themeColor="text1" w:themeTint="FF" w:themeShade="FF"/>
           <w:lang w:val="en-US"/>
         </w:rPr>
-        <w:t xml:space="preserve"> </w:t>
-      </w:r>
-      <w:del w:author="Lisa van Aardenne" w:date="2025-08-25T13:39:34.11Z" w:id="992372782">
-        <w:r>
-          <w:rPr>
-            <w:rFonts w:ascii="Times New Roman" w:hAnsi="Times New Roman" w:eastAsia="Times New Roman" w:cs="Times New Roman"/>
-            <w:b w:val="0"/>
-            <w:bCs w:val="0"/>
-            <w:i w:val="0"/>
-            <w:iCs w:val="0"/>
-            <w:caps w:val="0"/>
-            <w:smallCaps w:val="0"/>
-            <w:noProof w:val="0"/>
-            <w:color w:val="000000" w:themeColor="text1" w:themeTint="FF" w:themeShade="FF"/>
-            <w:lang w:val="en-US"/>
-          </w:rPr>
-          <w:delText>i</w:delText>
-        </w:r>
-      </w:del>
-      <w:ins w:author="Lisa van Aardenne" w:date="2025-08-25T13:39:43.98Z" w:id="592292240">
-        <w:r>
-          <w:rPr>
-            <w:rFonts w:ascii="Times New Roman" w:hAnsi="Times New Roman" w:eastAsia="Times New Roman" w:cs="Times New Roman"/>
-            <w:b w:val="0"/>
-            <w:bCs w:val="0"/>
-            <w:i w:val="0"/>
-            <w:iCs w:val="0"/>
-            <w:caps w:val="0"/>
-            <w:smallCaps w:val="0"/>
-            <w:noProof w:val="0"/>
-            <w:color w:val="000000" w:themeColor="text1" w:themeTint="FF" w:themeShade="FF"/>
-            <w:lang w:val="en-US"/>
-          </w:rPr>
-          <w:t>I</w:t>
-        </w:r>
-      </w:ins>
+        <w:t>on-premise</w:t>
+      </w:r>
       <w:r>
         <w:rPr>
           <w:rFonts w:ascii="Times New Roman" w:hAnsi="Times New Roman" w:eastAsia="Times New Roman" w:cs="Times New Roman"/>
@@ -476,59 +425,8 @@
           <w:color w:val="000000" w:themeColor="text1" w:themeTint="FF" w:themeShade="FF"/>
           <w:lang w:val="en-US"/>
         </w:rPr>
-        <w:t>nfrastructure transition during Year 5 to enhance data management capabilities through</w:t>
-      </w:r>
-      <w:ins w:author="Lisa van Aardenne" w:date="2025-08-25T13:40:52.022Z" w:id="559263515">
-        <w:r>
-          <w:rPr>
-            <w:rFonts w:ascii="Times New Roman" w:hAnsi="Times New Roman" w:eastAsia="Times New Roman" w:cs="Times New Roman"/>
-            <w:b w:val="0"/>
-            <w:bCs w:val="0"/>
-            <w:i w:val="0"/>
-            <w:iCs w:val="0"/>
-            <w:caps w:val="0"/>
-            <w:smallCaps w:val="0"/>
-            <w:noProof w:val="0"/>
-            <w:color w:val="000000" w:themeColor="text1" w:themeTint="FF" w:themeShade="FF"/>
-            <w:lang w:val="en-US"/>
-          </w:rPr>
-          <w:t xml:space="preserve"> migration from </w:t>
-        </w:r>
-      </w:ins>
-      <w:ins w:author="Lisa van Aardenne" w:date="2025-08-25T13:41:55.549Z" w:id="4242341">
-        <w:r>
-          <w:rPr>
-            <w:rFonts w:ascii="Times New Roman" w:hAnsi="Times New Roman" w:eastAsia="Times New Roman" w:cs="Times New Roman"/>
-            <w:b w:val="0"/>
-            <w:bCs w:val="0"/>
-            <w:i w:val="0"/>
-            <w:iCs w:val="0"/>
-            <w:caps w:val="0"/>
-            <w:smallCaps w:val="0"/>
-            <w:noProof w:val="0"/>
-            <w:color w:val="000000" w:themeColor="text1" w:themeTint="FF" w:themeShade="FF"/>
-            <w:lang w:val="en-US"/>
-          </w:rPr>
-          <w:t>on-premise</w:t>
-        </w:r>
-      </w:ins>
-      <w:ins w:author="Lisa van Aardenne" w:date="2025-08-25T13:40:52.022Z" w:id="1643465349">
-        <w:r>
-          <w:rPr>
-            <w:rFonts w:ascii="Times New Roman" w:hAnsi="Times New Roman" w:eastAsia="Times New Roman" w:cs="Times New Roman"/>
-            <w:b w:val="0"/>
-            <w:bCs w:val="0"/>
-            <w:i w:val="0"/>
-            <w:iCs w:val="0"/>
-            <w:caps w:val="0"/>
-            <w:smallCaps w:val="0"/>
-            <w:noProof w:val="0"/>
-            <w:color w:val="000000" w:themeColor="text1" w:themeTint="FF" w:themeShade="FF"/>
-            <w:lang w:val="en-US"/>
-          </w:rPr>
-          <w:t xml:space="preserve"> to</w:t>
-        </w:r>
-      </w:ins>
+        <w:t xml:space="preserve"> to cloud infrastructure. This amendment documents a transition period where dual infrastructure capability (UCT </w:t>
+      </w:r>
       <w:r>
         <w:rPr>
           <w:rFonts w:ascii="Times New Roman" w:hAnsi="Times New Roman" w:eastAsia="Times New Roman" w:cs="Times New Roman"/>
@@ -542,25 +440,8 @@
           <w:color w:val="000000" w:themeColor="text1" w:themeTint="FF" w:themeShade="FF"/>
           <w:lang w:val="en-US"/>
         </w:rPr>
-        <w:t xml:space="preserve"> cloud infrastructure</w:t>
-      </w:r>
-      <w:del w:author="Lisa van Aardenne" w:date="2025-08-25T13:40:58.051Z" w:id="960592127">
-        <w:r>
-          <w:rPr>
-            <w:rFonts w:ascii="Times New Roman" w:hAnsi="Times New Roman" w:eastAsia="Times New Roman" w:cs="Times New Roman"/>
-            <w:b w:val="0"/>
-            <w:bCs w:val="0"/>
-            <w:i w:val="0"/>
-            <w:iCs w:val="0"/>
-            <w:caps w:val="0"/>
-            <w:smallCaps w:val="0"/>
-            <w:noProof w:val="0"/>
-            <w:color w:val="000000" w:themeColor="text1" w:themeTint="FF" w:themeShade="FF"/>
-            <w:lang w:val="en-US"/>
-          </w:rPr>
-          <w:delText xml:space="preserve"> migration</w:delText>
-        </w:r>
-      </w:del>
+        <w:t>on-premise</w:t>
+      </w:r>
       <w:r>
         <w:rPr>
           <w:rFonts w:ascii="Times New Roman" w:hAnsi="Times New Roman" w:eastAsia="Times New Roman" w:cs="Times New Roman"/>
@@ -574,7 +455,7 @@
           <w:color w:val="000000" w:themeColor="text1" w:themeTint="FF" w:themeShade="FF"/>
           <w:lang w:val="en-US"/>
         </w:rPr>
-        <w:t xml:space="preserve">. This amendment documents a transition period where dual infrastructure capability (UCT </w:t>
+        <w:t xml:space="preserve"> and WHC-managed cloud) is </w:t>
       </w:r>
       <w:r>
         <w:rPr>
@@ -589,7 +470,7 @@
           <w:color w:val="000000" w:themeColor="text1" w:themeTint="FF" w:themeShade="FF"/>
           <w:lang w:val="en-US"/>
         </w:rPr>
-        <w:t>on-premise</w:t>
+        <w:t>maintained</w:t>
       </w:r>
       <w:r>
         <w:rPr>
@@ -604,7 +485,7 @@
           <w:color w:val="000000" w:themeColor="text1" w:themeTint="FF" w:themeShade="FF"/>
           <w:lang w:val="en-US"/>
         </w:rPr>
-        <w:t xml:space="preserve"> and WHC-managed cloud) is </w:t>
+        <w:t xml:space="preserve">, with complete migration to cloud by end of Year 5. All existing ethical safeguards are </w:t>
       </w:r>
       <w:r>
         <w:rPr>
@@ -634,9 +515,12 @@
           <w:color w:val="000000" w:themeColor="text1" w:themeTint="FF" w:themeShade="FF"/>
           <w:lang w:val="en-US"/>
         </w:rPr>
-        <w:t xml:space="preserve">, with complete migration to cloud by end of Year 5. All existing ethical safeguards are </w:t>
-      </w:r>
-      <w:r>
+        <w:t xml:space="preserve"> and enhanced.</w:t>
+      </w:r>
+    </w:p>
+    <w:p>
+      <w:pPr>
+        <w:spacing w:before="240" w:beforeAutospacing="off" w:after="240" w:afterAutospacing="off"/>
         <w:rPr>
           <w:rFonts w:ascii="Times New Roman" w:hAnsi="Times New Roman" w:eastAsia="Times New Roman" w:cs="Times New Roman"/>
           <w:b w:val="0"/>
@@ -649,7 +533,21 @@
           <w:color w:val="000000" w:themeColor="text1" w:themeTint="FF" w:themeShade="FF"/>
           <w:lang w:val="en-US"/>
         </w:rPr>
-        <w:t>maintained</w:t>
+      </w:pPr>
+      <w:r>
+        <w:rPr>
+          <w:rFonts w:ascii="Times New Roman" w:hAnsi="Times New Roman" w:eastAsia="Times New Roman" w:cs="Times New Roman"/>
+          <w:b w:val="1"/>
+          <w:bCs w:val="1"/>
+          <w:i w:val="0"/>
+          <w:iCs w:val="0"/>
+          <w:caps w:val="0"/>
+          <w:smallCaps w:val="0"/>
+          <w:noProof w:val="0"/>
+          <w:color w:val="000000" w:themeColor="text1" w:themeTint="FF" w:themeShade="FF"/>
+          <w:lang w:val="en-US"/>
+        </w:rPr>
+        <w:t>PARTICIPANT IMPACT:</w:t>
       </w:r>
       <w:r>
         <w:rPr>
@@ -664,60 +562,8 @@
           <w:color w:val="000000" w:themeColor="text1" w:themeTint="FF" w:themeShade="FF"/>
           <w:lang w:val="en-US"/>
         </w:rPr>
-        <w:t xml:space="preserve"> and enhanced.</w:t>
-      </w:r>
-    </w:p>
-    <w:p>
-      <w:pPr>
-        <w:spacing w:before="240" w:beforeAutospacing="off" w:after="240" w:afterAutospacing="off"/>
-      </w:pPr>
-      <w:r>
-        <w:rPr>
-          <w:rFonts w:ascii="Times New Roman" w:hAnsi="Times New Roman" w:eastAsia="Times New Roman" w:cs="Times New Roman"/>
-          <w:b w:val="1"/>
-          <w:bCs w:val="1"/>
-          <w:i w:val="0"/>
-          <w:iCs w:val="0"/>
-          <w:caps w:val="0"/>
-          <w:smallCaps w:val="0"/>
-          <w:noProof w:val="0"/>
-          <w:color w:val="000000" w:themeColor="text1" w:themeTint="FF" w:themeShade="FF"/>
-          <w:lang w:val="en-US"/>
-        </w:rPr>
-        <w:t>PARTICIPANT IMPACT:</w:t>
-      </w:r>
-      <w:r>
-        <w:rPr>
-          <w:rFonts w:ascii="Times New Roman" w:hAnsi="Times New Roman" w:eastAsia="Times New Roman" w:cs="Times New Roman"/>
-          <w:b w:val="0"/>
-          <w:bCs w:val="0"/>
-          <w:i w:val="0"/>
-          <w:iCs w:val="0"/>
-          <w:caps w:val="0"/>
-          <w:smallCaps w:val="0"/>
-          <w:noProof w:val="0"/>
-          <w:color w:val="000000" w:themeColor="text1" w:themeTint="FF" w:themeShade="FF"/>
-          <w:lang w:val="en-US"/>
-        </w:rPr>
         <w:t xml:space="preserve"> No direct impact on participants. </w:t>
       </w:r>
-      <w:del w:author="Lisa van Aardenne" w:date="2025-08-25T13:43:38.945Z" w:id="1286560229">
-        <w:r>
-          <w:rPr>
-            <w:rFonts w:ascii="Times New Roman" w:hAnsi="Times New Roman" w:eastAsia="Times New Roman" w:cs="Times New Roman"/>
-            <w:b w:val="0"/>
-            <w:bCs w:val="0"/>
-            <w:i w:val="0"/>
-            <w:iCs w:val="0"/>
-            <w:caps w:val="0"/>
-            <w:smallCaps w:val="0"/>
-            <w:noProof w:val="0"/>
-            <w:color w:val="000000" w:themeColor="text1" w:themeTint="FF" w:themeShade="FF"/>
-            <w:lang w:val="en-US"/>
-          </w:rPr>
-          <w:delText>Enhanced data protection and security measures only.</w:delText>
-        </w:r>
-      </w:del>
     </w:p>
     <w:p>
       <w:pPr>
@@ -1049,50 +895,7 @@
                 <w:smallCaps w:val="0"/>
                 <w:color w:val="000000" w:themeColor="text1" w:themeTint="FF" w:themeShade="FF"/>
               </w:rPr>
-              <w:t xml:space="preserve">Provides transparent timeline for infrastructure changes. Ensures stakeholder understanding that this is a temporary </w:t>
-            </w:r>
-            <w:del w:author="Lisa van Aardenne" w:date="2025-08-25T13:46:32.166Z" w:id="312138070">
-              <w:r>
-                <w:rPr>
-                  <w:rFonts w:ascii="Times New Roman" w:hAnsi="Times New Roman" w:eastAsia="Times New Roman" w:cs="Times New Roman"/>
-                  <w:b w:val="0"/>
-                  <w:bCs w:val="0"/>
-                  <w:i w:val="0"/>
-                  <w:iCs w:val="0"/>
-                  <w:caps w:val="0"/>
-                  <w:smallCaps w:val="0"/>
-                  <w:color w:val="000000" w:themeColor="text1" w:themeTint="FF" w:themeShade="FF"/>
-                </w:rPr>
-                <w:delText>transition</w:delText>
-              </w:r>
-            </w:del>
-            <w:ins w:author="Lisa van Aardenne" w:date="2025-08-25T13:46:22.574Z" w:id="1833909303">
-              <w:r>
-                <w:rPr>
-                  <w:rFonts w:ascii="Times New Roman" w:hAnsi="Times New Roman" w:eastAsia="Times New Roman" w:cs="Times New Roman"/>
-                  <w:b w:val="0"/>
-                  <w:bCs w:val="0"/>
-                  <w:i w:val="0"/>
-                  <w:iCs w:val="0"/>
-                  <w:caps w:val="0"/>
-                  <w:smallCaps w:val="0"/>
-                  <w:color w:val="000000" w:themeColor="text1" w:themeTint="FF" w:themeShade="FF"/>
-                </w:rPr>
-                <w:t xml:space="preserve"> situation</w:t>
-              </w:r>
-            </w:ins>
-            <w:r>
-              <w:rPr>
-                <w:rFonts w:ascii="Times New Roman" w:hAnsi="Times New Roman" w:eastAsia="Times New Roman" w:cs="Times New Roman"/>
-                <w:b w:val="0"/>
-                <w:bCs w:val="0"/>
-                <w:i w:val="0"/>
-                <w:iCs w:val="0"/>
-                <w:caps w:val="0"/>
-                <w:smallCaps w:val="0"/>
-                <w:color w:val="000000" w:themeColor="text1" w:themeTint="FF" w:themeShade="FF"/>
-              </w:rPr>
-              <w:t>, not permanent hybrid model. No impact on participant data protection.</w:t>
+              <w:t>Provides transparent timeline for infrastructure changes. Ensures stakeholder understanding that this is a temporary  situation, not permanent hybrid model. No impact on participant data protection.</w:t>
             </w:r>
           </w:p>
         </w:tc>
@@ -1187,7 +990,7 @@
                 <w:smallCaps w:val="0"/>
                 <w:color w:val="000000" w:themeColor="text1" w:themeTint="FF" w:themeShade="FF"/>
               </w:rPr>
-              <w:t>Added "during the transition period to WHC-managed cloud infrastructure" and specified dual capability as temporary measure</w:t>
+              <w:t>Added "during the transition period to WHC-managed cloud infrastructure" and specified dual capability as temporary measure during year 5 as health datasets are transferred.</w:t>
             </w:r>
           </w:p>
         </w:tc>
@@ -1839,19 +1642,6 @@
             <w:r>
               <w:rPr>
                 <w:rFonts w:ascii="Times New Roman" w:hAnsi="Times New Roman" w:eastAsia="Times New Roman" w:cs="Times New Roman"/>
-                <w:b w:val="1"/>
-                <w:bCs w:val="1"/>
-                <w:i w:val="0"/>
-                <w:iCs w:val="0"/>
-                <w:caps w:val="0"/>
-                <w:smallCaps w:val="0"/>
-                <w:color w:val="000000" w:themeColor="text1" w:themeTint="FF" w:themeShade="FF"/>
-              </w:rPr>
-              <w:t>NEW CRITICAL CHANGE:</w:t>
-            </w:r>
-            <w:r>
-              <w:rPr>
-                <w:rFonts w:ascii="Times New Roman" w:hAnsi="Times New Roman" w:eastAsia="Times New Roman" w:cs="Times New Roman"/>
                 <w:b w:val="0"/>
                 <w:bCs w:val="0"/>
                 <w:i w:val="0"/>
@@ -1860,7 +1650,7 @@
                 <w:smallCaps w:val="0"/>
                 <w:color w:val="000000" w:themeColor="text1" w:themeTint="FF" w:themeShade="FF"/>
               </w:rPr>
-              <w:t xml:space="preserve"> "All projects, regardless of whether they involve internal HE²AT Center Consortium members or external researchers, must go through the DAC for data access approval"</w:t>
+              <w:t>Added "All projects, regardless of whether they involve internal HE²AT Center Consortium members or external researchers, must go through the DAC for data access approval"</w:t>
             </w:r>
           </w:p>
         </w:tc>
@@ -3425,25 +3215,8 @@
           <w:color w:val="000000" w:themeColor="text1" w:themeTint="FF" w:themeShade="FF"/>
           <w:lang w:val="en-US"/>
         </w:rPr>
-        <w:t xml:space="preserve">These amendments document a </w:t>
-      </w:r>
-      <w:del w:author="Lisa van Aardenne" w:date="2025-08-25T13:51:07.346Z" w:id="505962247">
-        <w:r>
-          <w:rPr>
-            <w:rFonts w:ascii="Times New Roman" w:hAnsi="Times New Roman" w:eastAsia="Times New Roman" w:cs="Times New Roman"/>
-            <w:b w:val="0"/>
-            <w:bCs w:val="0"/>
-            <w:i w:val="0"/>
-            <w:iCs w:val="0"/>
-            <w:caps w:val="0"/>
-            <w:smallCaps w:val="0"/>
-            <w:noProof w:val="0"/>
-            <w:color w:val="000000" w:themeColor="text1" w:themeTint="FF" w:themeShade="FF"/>
-            <w:lang w:val="en-US"/>
-          </w:rPr>
-          <w:delText>temporary</w:delText>
-        </w:r>
-      </w:del>
+        <w:t xml:space="preserve">These amendments document </w:t>
+      </w:r>
       <w:r>
         <w:rPr>
           <w:rFonts w:ascii="Times New Roman" w:hAnsi="Times New Roman" w:eastAsia="Times New Roman" w:cs="Times New Roman"/>
@@ -3457,7 +3230,22 @@
           <w:color w:val="000000" w:themeColor="text1" w:themeTint="FF" w:themeShade="FF"/>
           <w:lang w:val="en-US"/>
         </w:rPr>
-        <w:t xml:space="preserve"> infrastructure transition during Year 5 that enhances data protection and research capabilities. The transition will be complete by end of Year 5 with full migration to secure cloud infrastructure. All existing ethical safeguards are </w:t>
+        <w:t>a</w:t>
+      </w:r>
+      <w:r>
+        <w:rPr>
+          <w:rFonts w:ascii="Times New Roman" w:hAnsi="Times New Roman" w:eastAsia="Times New Roman" w:cs="Times New Roman"/>
+          <w:b w:val="0"/>
+          <w:bCs w:val="0"/>
+          <w:i w:val="0"/>
+          <w:iCs w:val="0"/>
+          <w:caps w:val="0"/>
+          <w:smallCaps w:val="0"/>
+          <w:noProof w:val="0"/>
+          <w:color w:val="000000" w:themeColor="text1" w:themeTint="FF" w:themeShade="FF"/>
+          <w:lang w:val="en-US"/>
+        </w:rPr>
+        <w:t xml:space="preserve">  infrastructure transition during Year 5 that enhances data protection and research capabilities. The transition will be complete by end of Year 5 with full migration to secure cloud infrastructure. All existing ethical safeguards are </w:t>
       </w:r>
       <w:r>
         <w:rPr>

</xml_diff>